<commit_message>
Revise HW2 Exercise 3 to use only Week 4 lecture topics
Co-authored-by: jalvarado214e <jalvarado214e@csu.fullerton.edu>
</commit_message>
<xml_diff>
--- a/CPSC483_HW2_Jonathan_Alvarado.docx
+++ b/CPSC483_HW2_Jonathan_Alvarado.docx
@@ -493,298 +493,6 @@
         <w:t>85% accuracy looks good, but it's misleading because the data is imbalanced (only 3 of the 20 transactions are fraud). A model that predicted "Not Fraud" for everything would still get 17/20 = 85% accuracy while catching zero fraud. Precision, recall, and F1 tell you much more about how well the model actually detects fraud.</w:t>
       </w:r>
     </w:p>
-    <w:p>
-      <w:pPr>
-        <w:pStyle w:val="Heading1"/>
-      </w:pPr>
-      <w:r>
-        <w:t>Exercise 3 – Iris Dataset with Logistic Regression</w:t>
-      </w:r>
-    </w:p>
-    <w:p>
-      <w:r>
-        <w:rPr>
-          <w:b/>
-        </w:rPr>
-        <w:t xml:space="preserve">About the dataset: </w:t>
-      </w:r>
-      <w:r>
-        <w:rPr>
-          <w:i w:val="0"/>
-        </w:rPr>
-        <w:t>The Iris dataset has 150 instances, 50 for each of 3 species: Iris setosa, Iris versicolor, and Iris virginica. Each instance has 4 numeric features measured in cm: sepal length, sepal width, petal length, and petal width. Logistic regression is a binary classifier, so to handle 3 classes you have to use a multiclass strategy. The two I'd look at are One-vs-Rest (OvR) and One-vs-One (OvO).</w:t>
-      </w:r>
-    </w:p>
-    <w:p>
-      <w:r>
-        <w:rPr>
-          <w:i w:val="0"/>
-        </w:rPr>
-        <w:t>Before either strategy, I'd split the data into a training set and a test set (for example 80/20). I'd use a stratified split so each species shows up in the same proportion in both sets. I'd also standardize the 4 features so they're on the same scale.</w:t>
-      </w:r>
-    </w:p>
-    <w:p>
-      <w:pPr>
-        <w:pStyle w:val="Heading2"/>
-      </w:pPr>
-      <w:r>
-        <w:t>Strategy 1: One-vs-Rest (OvR)</w:t>
-      </w:r>
-    </w:p>
-    <w:p>
-      <w:r>
-        <w:rPr>
-          <w:b/>
-        </w:rPr>
-        <w:t xml:space="preserve">(a) Models to train: </w:t>
-      </w:r>
-      <w:r>
-        <w:rPr>
-          <w:i w:val="0"/>
-        </w:rPr>
-        <w:t>I'd train 3 binary logistic regression models, one per species:</w:t>
-      </w:r>
-    </w:p>
-    <w:p>
-      <w:pPr>
-        <w:pStyle w:val="ListBullet"/>
-      </w:pPr>
-      <w:r>
-        <w:t>Model 1: Setosa (positive, label 1) vs. not Setosa (Versicolor and Virginica, label 0)</w:t>
-      </w:r>
-    </w:p>
-    <w:p>
-      <w:pPr>
-        <w:pStyle w:val="ListBullet"/>
-      </w:pPr>
-      <w:r>
-        <w:t>Model 2: Versicolor vs. not Versicolor</w:t>
-      </w:r>
-    </w:p>
-    <w:p>
-      <w:pPr>
-        <w:pStyle w:val="ListBullet"/>
-      </w:pPr>
-      <w:r>
-        <w:t>Model 3: Virginica vs. not Virginica</w:t>
-      </w:r>
-    </w:p>
-    <w:p>
-      <w:r>
-        <w:rPr>
-          <w:i w:val="0"/>
-        </w:rPr>
-        <w:t>Each model trains on all of the training data (all 4 features), with the labels relabeled as 1/0 for that model's species. Since each species is only 1/3 of the data, each model sees about a 1:2 ratio of positives to negatives.</w:t>
-      </w:r>
-    </w:p>
-    <w:p>
-      <w:r>
-        <w:rPr>
-          <w:b/>
-        </w:rPr>
-        <w:t xml:space="preserve">(b) Process for new test instances: </w:t>
-      </w:r>
-      <w:r>
-        <w:rPr>
-          <w:i w:val="0"/>
-        </w:rPr>
-        <w:t>Run the new flower's 4 measurements through all 3 models. Each one outputs a probability that the flower belongs to its species (the sigmoid output). The prediction is the species whose model gives the highest probability.</w:t>
-      </w:r>
-    </w:p>
-    <w:p>
-      <w:r>
-        <w:rPr>
-          <w:b/>
-        </w:rPr>
-        <w:t xml:space="preserve">(c) Measuring performance: </w:t>
-      </w:r>
-      <w:r>
-        <w:rPr>
-          <w:i w:val="0"/>
-        </w:rPr>
-        <w:t>Since the classes are balanced (50/50/50), overall accuracy on the test set is a fair metric. I'd also make a 3×3 confusion matrix to see which species get confused with each other (probably Versicolor and Virginica, since Setosa is easy to separate). I'd also report per-class precision and recall, plus macro-averaged F1, to make sure no single species is doing badly. With only 150 samples, I'd use k-fold cross-validation (for example 5-fold) so the results don't depend too much on one lucky or unlucky split.</w:t>
-      </w:r>
-    </w:p>
-    <w:p>
-      <w:r>
-        <w:rPr>
-          <w:b/>
-        </w:rPr>
-        <w:t>(d) Benefits and drawbacks:</w:t>
-      </w:r>
-      <w:r>
-        <w:rPr>
-          <w:i w:val="0"/>
-        </w:rPr>
-      </w:r>
-    </w:p>
-    <w:p>
-      <w:pPr>
-        <w:pStyle w:val="ListBullet"/>
-      </w:pPr>
-      <w:r>
-        <w:rPr>
-          <w:b/>
-        </w:rPr>
-        <w:t xml:space="preserve">Benefits: </w:t>
-      </w:r>
-      <w:r>
-        <w:t>Simple to set up. Only needs K models for K classes. Each model uses all the training data. Easy to interpret, since each model answers "is it this species or not?"</w:t>
-      </w:r>
-    </w:p>
-    <w:p>
-      <w:pPr>
-        <w:pStyle w:val="ListBullet"/>
-      </w:pPr>
-      <w:r>
-        <w:rPr>
-          <w:b/>
-        </w:rPr>
-        <w:t xml:space="preserve">Drawbacks: </w:t>
-      </w:r>
-      <w:r>
-        <w:t>Each model trains on imbalanced data (1 positive class vs. 2 negative classes combined). The 3 models are trained separately, so their probability scores aren't guaranteed to be on the same scale, which can make "pick the highest" a little unreliable. Also, grouping Versicolor and Virginica together as "rest" can make the harder boundary between them less clear.</w:t>
-      </w:r>
-    </w:p>
-    <w:p>
-      <w:pPr>
-        <w:pStyle w:val="Heading2"/>
-      </w:pPr>
-      <w:r>
-        <w:t>Strategy 2: One-vs-One (OvO)</w:t>
-      </w:r>
-    </w:p>
-    <w:p>
-      <w:r>
-        <w:rPr>
-          <w:b/>
-        </w:rPr>
-        <w:t xml:space="preserve">(a) Models to train: </w:t>
-      </w:r>
-      <w:r>
-        <w:rPr>
-          <w:i w:val="0"/>
-        </w:rPr>
-        <w:t>I'd train one binary logistic regression model for every pair of species. That's 3 choose 2 = 3 models:</w:t>
-      </w:r>
-    </w:p>
-    <w:p>
-      <w:pPr>
-        <w:pStyle w:val="ListBullet"/>
-      </w:pPr>
-      <w:r>
-        <w:t>Model 1: Setosa vs. Versicolor, trained only on Setosa and Versicolor samples</w:t>
-      </w:r>
-    </w:p>
-    <w:p>
-      <w:pPr>
-        <w:pStyle w:val="ListBullet"/>
-      </w:pPr>
-      <w:r>
-        <w:t>Model 2: Setosa vs. Virginica, trained only on those two species</w:t>
-      </w:r>
-    </w:p>
-    <w:p>
-      <w:pPr>
-        <w:pStyle w:val="ListBullet"/>
-      </w:pPr>
-      <w:r>
-        <w:t>Model 3: Versicolor vs. Virginica, trained only on those two species</w:t>
-      </w:r>
-    </w:p>
-    <w:p>
-      <w:r>
-        <w:rPr>
-          <w:i w:val="0"/>
-        </w:rPr>
-        <w:t>Each model uses the 4 features but only about 2/3 of the training data (the two species involved), and each one is balanced 50/50.</w:t>
-      </w:r>
-    </w:p>
-    <w:p>
-      <w:r>
-        <w:rPr>
-          <w:b/>
-        </w:rPr>
-        <w:t xml:space="preserve">(b) Process for new test instances: </w:t>
-      </w:r>
-      <w:r>
-        <w:rPr>
-          <w:i w:val="0"/>
-        </w:rPr>
-        <w:t>Run the new flower through all 3 pairwise models. Each model "votes" for one of its two species. The species with the most votes is the prediction. If there's a 3-way tie (each species gets 1 vote), break it by picking the class with the highest total confidence (summed probabilities).</w:t>
-      </w:r>
-    </w:p>
-    <w:p>
-      <w:r>
-        <w:rPr>
-          <w:b/>
-        </w:rPr>
-        <w:t xml:space="preserve">(c) Measuring performance: </w:t>
-      </w:r>
-      <w:r>
-        <w:rPr>
-          <w:i w:val="0"/>
-        </w:rPr>
-        <w:t>Same approach as OvR so the two can be compared fairly: overall accuracy, a 3×3 confusion matrix, per-class precision/recall, and macro F1, all using k-fold cross-validation.</w:t>
-      </w:r>
-    </w:p>
-    <w:p>
-      <w:r>
-        <w:rPr>
-          <w:b/>
-        </w:rPr>
-        <w:t>(d) Benefits and drawbacks:</w:t>
-      </w:r>
-      <w:r>
-        <w:rPr>
-          <w:i w:val="0"/>
-        </w:rPr>
-      </w:r>
-    </w:p>
-    <w:p>
-      <w:pPr>
-        <w:pStyle w:val="ListBullet"/>
-      </w:pPr>
-      <w:r>
-        <w:rPr>
-          <w:b/>
-        </w:rPr>
-        <w:t xml:space="preserve">Benefits: </w:t>
-      </w:r>
-      <w:r>
-        <w:t>Every model trains on balanced data (50 vs. 50). Each model only has to learn the boundary between two species, which is a simpler problem. In particular, the Versicolor vs. Virginica model can focus on that harder boundary without Setosa getting in the way. The smaller training sets also make each model fast.</w:t>
-      </w:r>
-    </w:p>
-    <w:p>
-      <w:pPr>
-        <w:pStyle w:val="ListBullet"/>
-      </w:pPr>
-      <w:r>
-        <w:rPr>
-          <w:b/>
-        </w:rPr>
-        <w:t xml:space="preserve">Drawbacks: </w:t>
-      </w:r>
-      <w:r>
-        <w:t>The number of models grows as K(K−1)/2, so it scales badly with lots of classes (10 classes would need 45 models). Each model only sees part of the data. Voting can end in ties that need a tie-breaking rule. And the model gives votes instead of clean probabilities, which are harder to interpret.</w:t>
-      </w:r>
-    </w:p>
-    <w:p>
-      <w:pPr>
-        <w:pStyle w:val="Heading2"/>
-      </w:pPr>
-      <w:r>
-        <w:t>Recommendation</w:t>
-      </w:r>
-    </w:p>
-    <w:p>
-      <w:r>
-        <w:rPr>
-          <w:i w:val="0"/>
-        </w:rPr>
-        <w:t>For the Iris dataset, I'd go with One-vs-Rest. With only 3 classes, both strategies need exactly 3 models, so OvO's main advantage over OvR at large scale doesn't matter here, and OvR is simpler. Each OvR model also gets to use all the training data, which matters when the dataset is as small as 150 samples. The class imbalance inside each OvR model (1:2) is mild. Finally, Setosa is almost perfectly separable from the other two species, so most of the difficulty is just Versicolor vs. Virginica, which OvR handles fine. OvR gives clear probabilities, is easy to explain, and should be about as accurate as OvO on this dataset. If the Versicolor/Virginica confusion turned out to be bad in the confusion matrix, I'd try OvO as a comparison.</w:t>
-      </w:r>
-    </w:p>
     <w:sectPr>
       <w:pgSz w:w="12240" w:h="15840"/>
       <w:pgMar w:top="1440" w:right="1800" w:bottom="1440" w:left="1800" w:header="720" w:footer="720" w:gutter="0"/>

</xml_diff>

<commit_message>
Restore Exercise 3 section in HW2 Word document
Co-authored-by: jalvarado214e <jalvarado214e@csu.fullerton.edu>
</commit_message>
<xml_diff>
--- a/CPSC483_HW2_Jonathan_Alvarado.docx
+++ b/CPSC483_HW2_Jonathan_Alvarado.docx
@@ -493,6 +493,298 @@
         <w:t>85% accuracy looks good, but it's misleading because the data is imbalanced (only 3 of the 20 transactions are fraud). A model that predicted "Not Fraud" for everything would still get 17/20 = 85% accuracy while catching zero fraud. Precision, recall, and F1 tell you much more about how well the model actually detects fraud.</w:t>
       </w:r>
     </w:p>
+    <w:p>
+      <w:pPr>
+        <w:pStyle w:val="Heading1"/>
+      </w:pPr>
+      <w:r>
+        <w:t>Exercise 3 – Iris Dataset with Logistic Regression</w:t>
+      </w:r>
+    </w:p>
+    <w:p>
+      <w:r>
+        <w:rPr>
+          <w:b/>
+        </w:rPr>
+        <w:t xml:space="preserve">About the dataset: </w:t>
+      </w:r>
+      <w:r>
+        <w:rPr>
+          <w:i w:val="0"/>
+        </w:rPr>
+        <w:t>The Iris dataset has 150 flowers, 50 for each of 3 species: Iris setosa, Iris versicolor, and Iris virginica. Each flower has 4 features measured in cm: sepal length, sepal width, petal length, and petal width. The problem is that logistic regression is a binary classifier. It uses the sigmoid function σ(θᵀx) = 1 / (1 + e^(−θᵀx)) to give the probability that y = 1, and then uses a threshold (like 0.5) to pick between 2 classes. Since there are 3 species, I have to combine several binary logistic regression models. The two strategies I'd use are One-vs-Rest (OvR) and One-vs-One (OvO).</w:t>
+      </w:r>
+    </w:p>
+    <w:p>
+      <w:r>
+        <w:rPr>
+          <w:i w:val="0"/>
+        </w:rPr>
+        <w:t>For both strategies, I'd first split the 150 flowers into a training set and a test set (for example 80% train and 20% test). Every model would be scikit-learn's LogisticRegression(), which learns θ by minimizing the average log loss with gradient descent–style methods. It also includes regularization through C (default C = 1, and a higher C means less regularization).</w:t>
+      </w:r>
+    </w:p>
+    <w:p>
+      <w:pPr>
+        <w:pStyle w:val="Heading2"/>
+      </w:pPr>
+      <w:r>
+        <w:t>Strategy 1: One-vs-Rest (OvR)</w:t>
+      </w:r>
+    </w:p>
+    <w:p>
+      <w:r>
+        <w:rPr>
+          <w:b/>
+        </w:rPr>
+        <w:t xml:space="preserve">(a) Models to train: </w:t>
+      </w:r>
+      <w:r>
+        <w:rPr>
+          <w:i w:val="0"/>
+        </w:rPr>
+        <w:t>I'd train 3 binary logistic regression models, one per species:</w:t>
+      </w:r>
+    </w:p>
+    <w:p>
+      <w:pPr>
+        <w:pStyle w:val="ListBullet"/>
+      </w:pPr>
+      <w:r>
+        <w:t>Model 1: Setosa (y = 1) vs. not Setosa (Versicolor or Virginica, y = 0)</w:t>
+      </w:r>
+    </w:p>
+    <w:p>
+      <w:pPr>
+        <w:pStyle w:val="ListBullet"/>
+      </w:pPr>
+      <w:r>
+        <w:t>Model 2: Versicolor (y = 1) vs. not Versicolor (y = 0)</w:t>
+      </w:r>
+    </w:p>
+    <w:p>
+      <w:pPr>
+        <w:pStyle w:val="ListBullet"/>
+      </w:pPr>
+      <w:r>
+        <w:t>Model 3: Virginica (y = 1) vs. not Virginica (y = 0)</w:t>
+      </w:r>
+    </w:p>
+    <w:p>
+      <w:r>
+        <w:rPr>
+          <w:i w:val="0"/>
+        </w:rPr>
+        <w:t>Each model uses the whole training set and all 4 features. The only difference between them is how the labels are relabeled as 1 or 0. Each model learns its own θ, so its sigmoid output is the probability that a flower is its species.</w:t>
+      </w:r>
+    </w:p>
+    <w:p>
+      <w:r>
+        <w:rPr>
+          <w:b/>
+        </w:rPr>
+        <w:t xml:space="preserve">(b) Process for new test instances: </w:t>
+      </w:r>
+      <w:r>
+        <w:rPr>
+          <w:i w:val="0"/>
+        </w:rPr>
+        <w:t>I'd plug the new flower's 4 measurements into all 3 models, which gives 3 probabilities (for example Setosa 0.02, Versicolor 0.70, Virginica 0.35). I'd predict the species with the highest probability. I wouldn't use a 0.5 threshold on each model separately, because a flower could end up above 0.5 for two species or for none of them.</w:t>
+      </w:r>
+    </w:p>
+    <w:p>
+      <w:r>
+        <w:rPr>
+          <w:b/>
+        </w:rPr>
+        <w:t xml:space="preserve">(c) Measuring performance: </w:t>
+      </w:r>
+      <w:r>
+        <w:rPr>
+          <w:i w:val="0"/>
+        </w:rPr>
+        <w:t>I'd use accuracy on the test set. Unlike the fraud example, the classes here are balanced (50 of each species), so accuracy isn't misleading. I'd also make a 3×3 confusion matrix to see which species get mixed up. I expect the mix-ups to be between Versicolor and Virginica, since Setosa is easy to tell apart. For each species, I'd also compute precision and recall by treating that species as the positive label, the same way Fraud was the positive label in Exercise 1. Finally, I'd compare training accuracy to test accuracy (or look at a learning curve) to check for overfitting (high variance) or underfitting (high bias). If I found either, I'd adjust C.</w:t>
+      </w:r>
+    </w:p>
+    <w:p>
+      <w:r>
+        <w:rPr>
+          <w:b/>
+        </w:rPr>
+        <w:t>(d) Benefits and drawbacks:</w:t>
+      </w:r>
+      <w:r>
+        <w:rPr>
+          <w:i w:val="0"/>
+        </w:rPr>
+      </w:r>
+    </w:p>
+    <w:p>
+      <w:pPr>
+        <w:pStyle w:val="ListBullet"/>
+      </w:pPr>
+      <w:r>
+        <w:rPr>
+          <w:b/>
+        </w:rPr>
+        <w:t xml:space="preserve">Benefits: </w:t>
+      </w:r>
+      <w:r>
+        <w:t>Simple. You only need 1 model per species (3 models). Every model trains on all the training data, which matters because 150 flowers is a small dataset. Each model's output is easy to understand: "the probability this flower is species X."</w:t>
+      </w:r>
+    </w:p>
+    <w:p>
+      <w:pPr>
+        <w:pStyle w:val="ListBullet"/>
+      </w:pPr>
+      <w:r>
+        <w:rPr>
+          <w:b/>
+        </w:rPr>
+        <w:t xml:space="preserve">Drawbacks: </w:t>
+      </w:r>
+      <w:r>
+        <w:t>Each model trains on imbalanced data, because 1 species (50 flowers) is up against the other 2 combined (100 flowers). It's like the fraud example, just much less extreme. Lumping Versicolor and Virginica together as "the rest" can make it harder for a model to learn the boundary between those two, which is exactly the hard part of this problem. Also, the 3 models are trained separately, so their probabilities don't have to add up to 1, and two models can both be fairly confident.</w:t>
+      </w:r>
+    </w:p>
+    <w:p>
+      <w:pPr>
+        <w:pStyle w:val="Heading2"/>
+      </w:pPr>
+      <w:r>
+        <w:t>Strategy 2: One-vs-One (OvO)</w:t>
+      </w:r>
+    </w:p>
+    <w:p>
+      <w:r>
+        <w:rPr>
+          <w:b/>
+        </w:rPr>
+        <w:t xml:space="preserve">(a) Models to train: </w:t>
+      </w:r>
+      <w:r>
+        <w:rPr>
+          <w:i w:val="0"/>
+        </w:rPr>
+        <w:t>I'd train one binary logistic regression model for every pair of species, which is 3 models:</w:t>
+      </w:r>
+    </w:p>
+    <w:p>
+      <w:pPr>
+        <w:pStyle w:val="ListBullet"/>
+      </w:pPr>
+      <w:r>
+        <w:t>Model 1: Setosa (y = 1) vs. Versicolor (y = 0), trained only on Setosa and Versicolor flowers</w:t>
+      </w:r>
+    </w:p>
+    <w:p>
+      <w:pPr>
+        <w:pStyle w:val="ListBullet"/>
+      </w:pPr>
+      <w:r>
+        <w:t>Model 2: Setosa (y = 1) vs. Virginica (y = 0), trained only on Setosa and Virginica flowers</w:t>
+      </w:r>
+    </w:p>
+    <w:p>
+      <w:pPr>
+        <w:pStyle w:val="ListBullet"/>
+      </w:pPr>
+      <w:r>
+        <w:t>Model 3: Versicolor (y = 1) vs. Virginica (y = 0), trained only on Versicolor and Virginica flowers</w:t>
+      </w:r>
+    </w:p>
+    <w:p>
+      <w:r>
+        <w:rPr>
+          <w:i w:val="0"/>
+        </w:rPr>
+        <w:t>Each model uses all 4 features but only the training flowers from its 2 species (about 2/3 of the training set). Each model's data is balanced, 50 vs. 50 in the full dataset.</w:t>
+      </w:r>
+    </w:p>
+    <w:p>
+      <w:r>
+        <w:rPr>
+          <w:b/>
+        </w:rPr>
+        <w:t xml:space="preserve">(b) Process for new test instances: </w:t>
+      </w:r>
+      <w:r>
+        <w:rPr>
+          <w:i w:val="0"/>
+        </w:rPr>
+        <w:t>I'd plug the new flower into all 3 models. Each model uses a 0.5 threshold on its sigmoid output to vote for one of its 2 species. For example, if Model 3 outputs 0.8, it votes Versicolor. The species with the most votes (2 out of 3) is the prediction. If each species gets 1 vote, I'd break the tie by picking the vote that had the highest probability.</w:t>
+      </w:r>
+    </w:p>
+    <w:p>
+      <w:r>
+        <w:rPr>
+          <w:b/>
+        </w:rPr>
+        <w:t xml:space="preserve">(c) Measuring performance: </w:t>
+      </w:r>
+      <w:r>
+        <w:rPr>
+          <w:i w:val="0"/>
+        </w:rPr>
+        <w:t>Same as OvR so the two strategies can be compared fairly: test accuracy, a 3×3 confusion matrix, precision and recall for each species, and a training vs. test comparison (or learning curve) to check for overfitting or underfitting.</w:t>
+      </w:r>
+    </w:p>
+    <w:p>
+      <w:r>
+        <w:rPr>
+          <w:b/>
+        </w:rPr>
+        <w:t>(d) Benefits and drawbacks:</w:t>
+      </w:r>
+      <w:r>
+        <w:rPr>
+          <w:i w:val="0"/>
+        </w:rPr>
+      </w:r>
+    </w:p>
+    <w:p>
+      <w:pPr>
+        <w:pStyle w:val="ListBullet"/>
+      </w:pPr>
+      <w:r>
+        <w:rPr>
+          <w:b/>
+        </w:rPr>
+        <w:t xml:space="preserve">Benefits: </w:t>
+      </w:r>
+      <w:r>
+        <w:t>Every model trains on balanced data. Each model only has to separate 2 species, which is a simpler job. In particular, the Versicolor vs. Virginica model can focus entirely on the hardest pair without Setosa getting in the way.</w:t>
+      </w:r>
+    </w:p>
+    <w:p>
+      <w:pPr>
+        <w:pStyle w:val="ListBullet"/>
+      </w:pPr>
+      <w:r>
+        <w:rPr>
+          <w:b/>
+        </w:rPr>
+        <w:t xml:space="preserve">Drawbacks: </w:t>
+      </w:r>
+      <w:r>
+        <w:t>Each model only trains on part of the data (about 80 flowers instead of 120). Less training data can raise variance, meaning the model is more sensitive to which flowers happened to land in the training set and more likely to overfit. The number of models also grows quickly with more classes: K(K−1)/2 models, so 10 classes would need 45. Votes can also tie, so you need a tie-breaking rule.</w:t>
+      </w:r>
+    </w:p>
+    <w:p>
+      <w:pPr>
+        <w:pStyle w:val="Heading2"/>
+      </w:pPr>
+      <w:r>
+        <w:t>Recommendation</w:t>
+      </w:r>
+    </w:p>
+    <w:p>
+      <w:r>
+        <w:rPr>
+          <w:i w:val="0"/>
+        </w:rPr>
+        <w:t>For the Iris dataset, I'd use One-vs-Rest. With 3 species, both strategies need exactly 3 models, so OvO doesn't save anything and OvR is simpler. Each OvR model gets to train on all the training data (about 120 flowers instead of 80), which helps keep variance down on such a small dataset. The imbalance inside each OvR model (50 vs. 100) is mild, and Setosa is easy to separate, so the only real challenge is Versicolor vs. Virginica. After training, I'd check the confusion matrix. If Versicolor and Virginica were getting mixed up a lot, I'd tune C or try OvO to see if it does better on that pair.</w:t>
+      </w:r>
+    </w:p>
     <w:sectPr>
       <w:pgSz w:w="12240" w:h="15840"/>
       <w:pgMar w:top="1440" w:right="1800" w:bottom="1440" w:left="1800" w:header="720" w:footer="720" w:gutter="0"/>

</xml_diff>

<commit_message>
Replace One-vs-One with two-step approach in HW2 Exercise 3
Co-authored-by: jalvarado214e <jalvarado214e@csu.fullerton.edu>
</commit_message>
<xml_diff>
--- a/CPSC483_HW2_Jonathan_Alvarado.docx
+++ b/CPSC483_HW2_Jonathan_Alvarado.docx
@@ -512,7 +512,7 @@
         <w:rPr>
           <w:i w:val="0"/>
         </w:rPr>
-        <w:t>The Iris dataset has 150 flowers, 50 for each of 3 species: Iris setosa, Iris versicolor, and Iris virginica. Each flower has 4 features measured in cm: sepal length, sepal width, petal length, and petal width. The problem is that logistic regression is a binary classifier. It uses the sigmoid function σ(θᵀx) = 1 / (1 + e^(−θᵀx)) to give the probability that y = 1, and then uses a threshold (like 0.5) to pick between 2 classes. Since there are 3 species, I have to combine several binary logistic regression models. The two strategies I'd use are One-vs-Rest (OvR) and One-vs-One (OvO).</w:t>
+        <w:t>The Iris dataset has 150 flowers, 50 for each of 3 species: Iris setosa, Iris versicolor, and Iris virginica. Each flower has 4 features measured in cm: sepal length, sepal width, petal length, and petal width. The problem is that logistic regression is a binary classifier. It uses the sigmoid function σ(θᵀx) = 1 / (1 + e^(−θᵀx)) to give the probability that y = 1, and then uses a threshold (like 0.5) to pick between 2 classes. Since there are 3 species, I have to combine several binary logistic regression models. The two strategies I'd use are training one model per species, and a two-step approach. The UCI description also says one species is linearly separable from the other 2, but the other 2 are not linearly separable from each other. That species is Setosa, and the fact matters for strategy 2.</w:t>
       </w:r>
     </w:p>
     <w:p>
@@ -528,7 +528,7 @@
         <w:pStyle w:val="Heading2"/>
       </w:pPr>
       <w:r>
-        <w:t>Strategy 1: One-vs-Rest (OvR)</w:t>
+        <w:t>Strategy 1: One Model per Species</w:t>
       </w:r>
     </w:p>
     <w:p>
@@ -643,7 +643,7 @@
         <w:t xml:space="preserve">Drawbacks: </w:t>
       </w:r>
       <w:r>
-        <w:t>Each model trains on imbalanced data, because 1 species (50 flowers) is up against the other 2 combined (100 flowers). It's like the fraud example, just much less extreme. Lumping Versicolor and Virginica together as "the rest" can make it harder for a model to learn the boundary between those two, which is exactly the hard part of this problem. Also, the 3 models are trained separately, so their probabilities don't have to add up to 1, and two models can both be fairly confident.</w:t>
+        <w:t>Each model trains on imbalanced data, because 1 species (50 flowers) is up against the other 2 combined (100 flowers). It's like the fraud example, just much less extreme. Lumping Versicolor and Virginica together as "not that species" can make it harder for a model to learn the boundary between those two, which is exactly the hard part of this problem. Also, the 3 models are trained separately, so their probabilities don't have to add up to 1, and two models can both be fairly confident.</w:t>
       </w:r>
     </w:p>
     <w:p>
@@ -651,7 +651,7 @@
         <w:pStyle w:val="Heading2"/>
       </w:pPr>
       <w:r>
-        <w:t>Strategy 2: One-vs-One (OvO)</w:t>
+        <w:t>Strategy 2: Two-Step Approach</w:t>
       </w:r>
     </w:p>
     <w:p>
@@ -665,7 +665,7 @@
         <w:rPr>
           <w:i w:val="0"/>
         </w:rPr>
-        <w:t>I'd train one binary logistic regression model for every pair of species, which is 3 models:</w:t>
+        <w:t>I'd train 2 binary logistic regression models and use them one after the other:</w:t>
       </w:r>
     </w:p>
     <w:p>
@@ -673,7 +673,13 @@
         <w:pStyle w:val="ListBullet"/>
       </w:pPr>
       <w:r>
-        <w:t>Model 1: Setosa (y = 1) vs. Versicolor (y = 0), trained only on Setosa and Versicolor flowers</w:t>
+        <w:rPr>
+          <w:b/>
+        </w:rPr>
+        <w:t xml:space="preserve">Model A: </w:t>
+      </w:r>
+      <w:r>
+        <w:t>Setosa (y = 1) vs. not Setosa (Versicolor or Virginica, y = 0), trained on the whole training set.</w:t>
       </w:r>
     </w:p>
     <w:p>
@@ -681,15 +687,13 @@
         <w:pStyle w:val="ListBullet"/>
       </w:pPr>
       <w:r>
-        <w:t>Model 2: Setosa (y = 1) vs. Virginica (y = 0), trained only on Setosa and Virginica flowers</w:t>
+        <w:rPr>
+          <w:b/>
+        </w:rPr>
+        <w:t xml:space="preserve">Model B: </w:t>
       </w:r>
-    </w:p>
-    <w:p>
-      <w:pPr>
-        <w:pStyle w:val="ListBullet"/>
-      </w:pPr>
       <w:r>
-        <w:t>Model 3: Versicolor (y = 1) vs. Virginica (y = 0), trained only on Versicolor and Virginica flowers</w:t>
+        <w:t>Versicolor (y = 1) vs. Virginica (y = 0), trained only on the Versicolor and Virginica flowers in the training set.</w:t>
       </w:r>
     </w:p>
     <w:p>
@@ -697,7 +701,7 @@
         <w:rPr>
           <w:i w:val="0"/>
         </w:rPr>
-        <w:t>Each model uses all 4 features but only the training flowers from its 2 species (about 2/3 of the training set). Each model's data is balanced, 50 vs. 50 in the full dataset.</w:t>
+        <w:t>Both models use all 4 features. I put Setosa first because UCI says it's the species that is linearly separable, so Model A should almost never get it wrong. Model B's data is balanced (50 vs. 50 in the full dataset).</w:t>
       </w:r>
     </w:p>
     <w:p>
@@ -711,7 +715,7 @@
         <w:rPr>
           <w:i w:val="0"/>
         </w:rPr>
-        <w:t>I'd plug the new flower into all 3 models. Each model uses a 0.5 threshold on its sigmoid output to vote for one of its 2 species. For example, if Model 3 outputs 0.8, it votes Versicolor. The species with the most votes (2 out of 3) is the prediction. If each species gets 1 vote, I'd break the tie by picking the vote that had the highest probability.</w:t>
+        <w:t>I'd plug the new flower into Model A first. If its sigmoid output is 0.5 or higher, I predict Setosa and stop. Otherwise, I plug the flower into Model B. If Model B's output is 0.5 or higher, I predict Versicolor, and if not, Virginica.</w:t>
       </w:r>
     </w:p>
     <w:p>
@@ -725,7 +729,7 @@
         <w:rPr>
           <w:i w:val="0"/>
         </w:rPr>
-        <w:t>Same as OvR so the two strategies can be compared fairly: test accuracy, a 3×3 confusion matrix, precision and recall for each species, and a training vs. test comparison (or learning curve) to check for overfitting or underfitting.</w:t>
+        <w:t>Same as strategy 1 so the two can be compared fairly: test accuracy, a 3×3 confusion matrix, precision and recall for each species, and a training vs. test comparison (or learning curve) to check for overfitting or underfitting. For this strategy, I'd also check each model on its own. Model A's accuracy shows whether the first step is really almost perfect, and Model B's accuracy shows how well the hard pair is separated.</w:t>
       </w:r>
     </w:p>
     <w:p>
@@ -752,7 +756,7 @@
         <w:t xml:space="preserve">Benefits: </w:t>
       </w:r>
       <w:r>
-        <w:t>Every model trains on balanced data. Each model only has to separate 2 species, which is a simpler job. In particular, the Versicolor vs. Virginica model can focus entirely on the hardest pair without Setosa getting in the way.</w:t>
+        <w:t>Only 2 models instead of 3, and every flower only goes through 1 or 2 of them. Each model is a normal yes/no problem with a 0.5 threshold, just like in class. Model B's data is balanced and it focuses entirely on the hardest pair, Versicolor vs. Virginica, without Setosa getting in the way.</w:t>
       </w:r>
     </w:p>
     <w:p>
@@ -766,7 +770,7 @@
         <w:t xml:space="preserve">Drawbacks: </w:t>
       </w:r>
       <w:r>
-        <w:t>Each model only trains on part of the data (about 80 flowers instead of 120). Less training data can raise variance, meaning the model is more sensitive to which flowers happened to land in the training set and more likely to overfit. The number of models also grows quickly with more classes: K(K−1)/2 models, so 10 classes would need 45. Votes can also tie, so you need a tie-breaking rule.</w:t>
+        <w:t>Mistakes carry over. If Model A calls a Setosa "not Setosa," Model B has to pick Versicolor or Virginica, so the flower is guaranteed to be wrong. Model A's data is imbalanced (50 Setosa vs. 100 others), though that's not a big deal because Setosa is easy to separate. Model B only trains on about 80 flowers instead of 120, and less training data can raise variance, meaning the model is more sensitive to which flowers ended up in the training set and more likely to overfit. The order also had to be chosen by hand from what I know about the data, which wouldn't work as easily on a dataset with more classes.</w:t>
       </w:r>
     </w:p>
     <w:p>
@@ -782,7 +786,7 @@
         <w:rPr>
           <w:i w:val="0"/>
         </w:rPr>
-        <w:t>For the Iris dataset, I'd use One-vs-Rest. With 3 species, both strategies need exactly 3 models, so OvO doesn't save anything and OvR is simpler. Each OvR model gets to train on all the training data (about 120 flowers instead of 80), which helps keep variance down on such a small dataset. The imbalance inside each OvR model (50 vs. 100) is mild, and Setosa is easy to separate, so the only real challenge is Versicolor vs. Virginica. After training, I'd check the confusion matrix. If Versicolor and Virginica were getting mixed up a lot, I'd tune C or try OvO to see if it does better on that pair.</w:t>
+        <w:t>For the Iris dataset, I'd use the two-step approach. UCI says Setosa is linearly separable from the other two species, so Model A should be almost perfect, and the drawback of mistakes carrying over barely applies. That leaves Model B, which spends all of its effort on Versicolor vs. Virginica, the only pair that's actually hard, using balanced data. Strategy 1 lumps those two species into "not X," which can blur that boundary. Model B does train on less data, so I'd use a learning curve to check it for overfitting and tune C if needed. If the confusion matrix showed the two-step approach doing worse than strategy 1, I'd switch to strategy 1.</w:t>
       </w:r>
     </w:p>
     <w:sectPr>

</xml_diff>